<commit_message>
Remove em dashes across all docs and Word file
Replace em dashes with plain hyphens in README, notes, REQUIREMENTS,
REFLECTION, and regenerate the Word document without them.
</commit_message>
<xml_diff>
--- a/docs/Android_Studio_Assignment_Justin_Guida.docx
+++ b/docs/Android_Studio_Assignment_Justin_Guida.docx
@@ -7,7 +7,7 @@
         <w:pStyle w:val="Title"/>
       </w:pPr>
       <w:r>
-        <w:t>Introduction to Android Studio — Layout Editor Assignment</w:t>
+        <w:t>Introduction to Android Studio - Layout Editor Assignment</w:t>
       </w:r>
     </w:p>
     <w:p>
@@ -24,7 +24,7 @@
         <w:pStyle w:val="Heading1"/>
       </w:pPr>
       <w:r>
-        <w:t>Layout Editor — activity_main.xml</w:t>
+        <w:t>Layout Editor - activity_main.xml</w:t>
       </w:r>
     </w:p>
     <w:p>
@@ -39,7 +39,7 @@
       <w:r>
         <w:drawing>
           <wp:inline xmlns:a="http://schemas.openxmlformats.org/drawingml/2006/main" xmlns:pic="http://schemas.openxmlformats.org/drawingml/2006/picture">
-            <wp:extent cx="2377440" cy="4460682"/>
+            <wp:extent cx="2377440" cy="1546088"/>
             <wp:docPr id="1" name="Picture 1"/>
             <wp:cNvGraphicFramePr>
               <a:graphicFrameLocks noChangeAspect="1"/>
@@ -60,7 +60,7 @@
                   <pic:spPr>
                     <a:xfrm>
                       <a:off x="0" y="0"/>
-                      <a:ext cx="2377440" cy="4460682"/>
+                      <a:ext cx="2377440" cy="1546088"/>
                     </a:xfrm>
                     <a:prstGeom prst="rect"/>
                   </pic:spPr>
@@ -86,7 +86,7 @@
       <w:r>
         <w:drawing>
           <wp:inline xmlns:a="http://schemas.openxmlformats.org/drawingml/2006/main" xmlns:pic="http://schemas.openxmlformats.org/drawingml/2006/picture">
-            <wp:extent cx="2926080" cy="4112328"/>
+            <wp:extent cx="2926080" cy="1450848"/>
             <wp:docPr id="2" name="Picture 2"/>
             <wp:cNvGraphicFramePr>
               <a:graphicFrameLocks noChangeAspect="1"/>
@@ -107,7 +107,7 @@
                   <pic:spPr>
                     <a:xfrm>
                       <a:off x="0" y="0"/>
-                      <a:ext cx="2926080" cy="4112328"/>
+                      <a:ext cx="2926080" cy="1450848"/>
                     </a:xfrm>
                     <a:prstGeom prst="rect"/>
                   </pic:spPr>
@@ -138,7 +138,7 @@
     </w:p>
     <w:p>
       <w:r>
-        <w:t>The biggest challenge I ran into was getting the button centered in the middle of the screen. At first nothing I did seemed to move it. I eventually learned that centering is not done on the button itself — you have to select the root LinearLayout in the Component Tree and change its gravity value. Once I unchecked bottom and set gravity to center (or checked center_horizontal and center_vertical together), all three elements finally moved to the middle. Understanding the difference between gravity (which positions the children inside a container) and layout_gravity (which positions an element inside its parent) was the key insight that made this click.</w:t>
+        <w:t>The biggest challenge I ran into was getting the button centered in the middle of the screen. At first nothing I did seemed to move it. I eventually learned that centering is not done on the button itself - you have to select the root LinearLayout in the Component Tree and change its gravity value. Once I unchecked bottom and set gravity to center (or checked center_horizontal and center_vertical together), all three elements finally moved to the middle. Understanding the difference between gravity (which positions the children inside a container) and layout_gravity (which positions an element inside its parent) was the key insight that made this click.</w:t>
       </w:r>
     </w:p>
     <w:p>

</xml_diff>

<commit_message>
Remove dash punctuation entirely; use commas/colons instead
Replace connective dashes with proper punctuation across README, notes,
REQUIREMENTS, REFLECTION, and the Word doc. Structural markdown hyphens
(bullets, table rules) and compound words are kept.
</commit_message>
<xml_diff>
--- a/docs/Android_Studio_Assignment_Justin_Guida.docx
+++ b/docs/Android_Studio_Assignment_Justin_Guida.docx
@@ -7,7 +7,7 @@
         <w:pStyle w:val="Title"/>
       </w:pPr>
       <w:r>
-        <w:t>Introduction to Android Studio - Layout Editor Assignment</w:t>
+        <w:t>Introduction to Android Studio: Layout Editor Assignment</w:t>
       </w:r>
     </w:p>
     <w:p>
@@ -24,7 +24,7 @@
         <w:pStyle w:val="Heading1"/>
       </w:pPr>
       <w:r>
-        <w:t>Layout Editor - activity_main.xml</w:t>
+        <w:t>Layout Editor: activity_main.xml</w:t>
       </w:r>
     </w:p>
     <w:p>
@@ -138,7 +138,7 @@
     </w:p>
     <w:p>
       <w:r>
-        <w:t>The biggest challenge I ran into was getting the button centered in the middle of the screen. At first nothing I did seemed to move it. I eventually learned that centering is not done on the button itself - you have to select the root LinearLayout in the Component Tree and change its gravity value. Once I unchecked bottom and set gravity to center (or checked center_horizontal and center_vertical together), all three elements finally moved to the middle. Understanding the difference between gravity (which positions the children inside a container) and layout_gravity (which positions an element inside its parent) was the key insight that made this click.</w:t>
+        <w:t>The biggest challenge I ran into was getting the button centered in the middle of the screen. At first nothing I did seemed to move it. I eventually learned that centering is not done on the button itself, you have to select the root LinearLayout in the Component Tree and change its gravity value. Once I unchecked bottom and set gravity to center (or checked center_horizontal and center_vertical together), all three elements finally moved to the middle. Understanding the difference between gravity (which positions the children inside a container) and layout_gravity (which positions an element inside its parent) was the key insight that made this click.</w:t>
       </w:r>
     </w:p>
     <w:p>
@@ -159,7 +159,7 @@
           <w:color w:val="666666"/>
           <w:sz w:val="18"/>
         </w:rPr>
-        <w:t>(Discussion word count: ~366 words.)</w:t>
+        <w:t>(Discussion word count: ~365 words.)</w:t>
       </w:r>
     </w:p>
     <w:sectPr>

</xml_diff>

<commit_message>
Sync docs: match submitted Word doc; full-res screenshots and reflection text
</commit_message>
<xml_diff>
--- a/docs/Android_Studio_Assignment_Justin_Guida.docx
+++ b/docs/Android_Studio_Assignment_Justin_Guida.docx
@@ -12,13 +12,9 @@
     </w:p>
     <w:p>
       <w:r>
-        <w:rPr>
-          <w:b/>
-        </w:rPr>
         <w:t>Justin Guida</w:t>
       </w:r>
     </w:p>
-    <w:p/>
     <w:p>
       <w:pPr>
         <w:pStyle w:val="Heading1"/>
@@ -29,7 +25,7 @@
     </w:p>
     <w:p>
       <w:r>
-        <w:t>The layout contains three objects: a Button (buttonSayHello, text “Say Hello”), a Plain Text / EditText (nameText), and a TextView (textGreeting) with no text.</w:t>
+        <w:t>The layout contains three objects: a Button (buttonSayHello, text “Say Hello”), a Plain Text / EditText (nameText), and a TextView (textGreeting) with no text. All three are children of a vertical LinearLayout (rootLayout), centered on the screen.</w:t>
       </w:r>
     </w:p>
     <w:p>
@@ -39,7 +35,7 @@
       <w:r>
         <w:drawing>
           <wp:inline xmlns:a="http://schemas.openxmlformats.org/drawingml/2006/main" xmlns:pic="http://schemas.openxmlformats.org/drawingml/2006/picture">
-            <wp:extent cx="2377440" cy="1546088"/>
+            <wp:extent cx="5943600" cy="2948120"/>
             <wp:docPr id="1" name="Picture 1"/>
             <wp:cNvGraphicFramePr>
               <a:graphicFrameLocks noChangeAspect="1"/>
@@ -48,7 +44,7 @@
               <a:graphicData uri="http://schemas.openxmlformats.org/drawingml/2006/picture">
                 <pic:pic>
                   <pic:nvPicPr>
-                    <pic:cNvPr id="0" name="layout-preview.png"/>
+                    <pic:cNvPr id="0" name="Screenshot 2026-07-19 at 6.03.55 PM.png"/>
                     <pic:cNvPicPr/>
                   </pic:nvPicPr>
                   <pic:blipFill>
@@ -60,7 +56,7 @@
                   <pic:spPr>
                     <a:xfrm>
                       <a:off x="0" y="0"/>
-                      <a:ext cx="2377440" cy="1546088"/>
+                      <a:ext cx="5943600" cy="2948120"/>
                     </a:xfrm>
                     <a:prstGeom prst="rect"/>
                   </pic:spPr>
@@ -73,10 +69,28 @@
     </w:p>
     <w:p>
       <w:pPr>
+        <w:jc w:val="center"/>
+      </w:pPr>
+      <w:r>
+        <w:rPr>
+          <w:i/>
+          <w:color w:val="555555"/>
+          <w:sz w:val="18"/>
+        </w:rPr>
+        <w:t>Figure 1. Layout Editor for activity_main.xml. The Component Tree (lower left) lists all three objects: buttonSayHello, nameText (Plain Text), and textGreeting. The design and blueprint views show the “Say Hello” button, the plain-text field, and the empty TextView.</w:t>
+      </w:r>
+    </w:p>
+    <w:p>
+      <w:pPr>
         <w:pStyle w:val="Heading1"/>
       </w:pPr>
       <w:r>
-        <w:t>Component Tree</w:t>
+        <w:t>Element Identification (IDs and Attributes)</w:t>
+      </w:r>
+    </w:p>
+    <w:p>
+      <w:r>
+        <w:t>Each element was given a relevant ID and its text set according to the instructions. The screenshots below show each object selected in the Component Tree with its Attributes panel open, confirming the ID and text values.</w:t>
       </w:r>
     </w:p>
     <w:p>
@@ -86,7 +100,7 @@
       <w:r>
         <w:drawing>
           <wp:inline xmlns:a="http://schemas.openxmlformats.org/drawingml/2006/main" xmlns:pic="http://schemas.openxmlformats.org/drawingml/2006/picture">
-            <wp:extent cx="2926080" cy="1450848"/>
+            <wp:extent cx="5943600" cy="2900286"/>
             <wp:docPr id="2" name="Picture 2"/>
             <wp:cNvGraphicFramePr>
               <a:graphicFrameLocks noChangeAspect="1"/>
@@ -95,7 +109,7 @@
               <a:graphicData uri="http://schemas.openxmlformats.org/drawingml/2006/picture">
                 <pic:pic>
                   <pic:nvPicPr>
-                    <pic:cNvPr id="0" name="component-tree.png"/>
+                    <pic:cNvPr id="0" name="Screenshot 2026-07-19 at 6.04.07 PM.png"/>
                     <pic:cNvPicPr/>
                   </pic:nvPicPr>
                   <pic:blipFill>
@@ -107,7 +121,7 @@
                   <pic:spPr>
                     <a:xfrm>
                       <a:off x="0" y="0"/>
-                      <a:ext cx="2926080" cy="1450848"/>
+                      <a:ext cx="5943600" cy="2900286"/>
                     </a:xfrm>
                     <a:prstGeom prst="rect"/>
                   </pic:spPr>
@@ -119,8 +133,120 @@
       </w:r>
     </w:p>
     <w:p>
+      <w:pPr>
+        <w:jc w:val="center"/>
+      </w:pPr>
       <w:r>
-        <w:br w:type="page"/>
+        <w:rPr>
+          <w:i/>
+          <w:color w:val="555555"/>
+          <w:sz w:val="18"/>
+        </w:rPr>
+        <w:t>Figure 2. Button selected. id = buttonSayHello, text = @string/say_hello (“Say Hello”), layout_width = wrap_content.</w:t>
+      </w:r>
+    </w:p>
+    <w:p>
+      <w:pPr>
+        <w:jc w:val="center"/>
+      </w:pPr>
+      <w:r>
+        <w:drawing>
+          <wp:inline xmlns:a="http://schemas.openxmlformats.org/drawingml/2006/main" xmlns:pic="http://schemas.openxmlformats.org/drawingml/2006/picture">
+            <wp:extent cx="5943600" cy="3031078"/>
+            <wp:docPr id="3" name="Picture 3"/>
+            <wp:cNvGraphicFramePr>
+              <a:graphicFrameLocks noChangeAspect="1"/>
+            </wp:cNvGraphicFramePr>
+            <a:graphic>
+              <a:graphicData uri="http://schemas.openxmlformats.org/drawingml/2006/picture">
+                <pic:pic>
+                  <pic:nvPicPr>
+                    <pic:cNvPr id="0" name="Screenshot 2026-07-19 at 6.04.20 PM.png"/>
+                    <pic:cNvPicPr/>
+                  </pic:nvPicPr>
+                  <pic:blipFill>
+                    <a:blip r:embed="rId11"/>
+                    <a:stretch>
+                      <a:fillRect/>
+                    </a:stretch>
+                  </pic:blipFill>
+                  <pic:spPr>
+                    <a:xfrm>
+                      <a:off x="0" y="0"/>
+                      <a:ext cx="5943600" cy="3031078"/>
+                    </a:xfrm>
+                    <a:prstGeom prst="rect"/>
+                  </pic:spPr>
+                </pic:pic>
+              </a:graphicData>
+            </a:graphic>
+          </wp:inline>
+        </w:drawing>
+      </w:r>
+    </w:p>
+    <w:p>
+      <w:pPr>
+        <w:jc w:val="center"/>
+      </w:pPr>
+      <w:r>
+        <w:rPr>
+          <w:i/>
+          <w:color w:val="555555"/>
+          <w:sz w:val="18"/>
+        </w:rPr>
+        <w:t>Figure 3. Plain Text field selected (EditText). id = nameText, with a hint of “Enter your name.”</w:t>
+      </w:r>
+    </w:p>
+    <w:p>
+      <w:pPr>
+        <w:jc w:val="center"/>
+      </w:pPr>
+      <w:r>
+        <w:drawing>
+          <wp:inline xmlns:a="http://schemas.openxmlformats.org/drawingml/2006/main" xmlns:pic="http://schemas.openxmlformats.org/drawingml/2006/picture">
+            <wp:extent cx="5943600" cy="3078007"/>
+            <wp:docPr id="4" name="Picture 4"/>
+            <wp:cNvGraphicFramePr>
+              <a:graphicFrameLocks noChangeAspect="1"/>
+            </wp:cNvGraphicFramePr>
+            <a:graphic>
+              <a:graphicData uri="http://schemas.openxmlformats.org/drawingml/2006/picture">
+                <pic:pic>
+                  <pic:nvPicPr>
+                    <pic:cNvPr id="0" name="Screenshot 2026-07-19 at 6.04.35 PM.png"/>
+                    <pic:cNvPicPr/>
+                  </pic:nvPicPr>
+                  <pic:blipFill>
+                    <a:blip r:embed="rId12"/>
+                    <a:stretch>
+                      <a:fillRect/>
+                    </a:stretch>
+                  </pic:blipFill>
+                  <pic:spPr>
+                    <a:xfrm>
+                      <a:off x="0" y="0"/>
+                      <a:ext cx="5943600" cy="3078007"/>
+                    </a:xfrm>
+                    <a:prstGeom prst="rect"/>
+                  </pic:spPr>
+                </pic:pic>
+              </a:graphicData>
+            </a:graphic>
+          </wp:inline>
+        </w:drawing>
+      </w:r>
+    </w:p>
+    <w:p>
+      <w:pPr>
+        <w:jc w:val="center"/>
+      </w:pPr>
+      <w:r>
+        <w:rPr>
+          <w:i/>
+          <w:color w:val="555555"/>
+          <w:sz w:val="18"/>
+        </w:rPr>
+        <w:t>Figure 4. TextView selected. id = textGreeting, with all text removed as required.</w:t>
       </w:r>
     </w:p>
     <w:p>
@@ -133,17 +259,17 @@
     </w:p>
     <w:p>
       <w:r>
-        <w:t>My initial experience with Android Studio was a mix of curiosity and frustration, which I think is normal when learning a brand new tool. Setting the project up was straightforward once I remembered to choose the No Activity option so that I could select Java as the language, but the first-time build did take several minutes while the environment downloaded and configured its dependencies. Watching the Build tab at the bottom of the screen helped me confirm it was actually working and not frozen.</w:t>
+        <w:t>My initial experience with Android Studio was a mix of curiosity and frustration, which I think is normal when learning a brand-new tool. Setting the project up was straightforward once I followed the instructions on the page, I remembered to choose the No Activity option so that I could select Java as the language, the first-time build didn’t take several minutes which was nice I believe that was due to my Apple M4 which was quick.</w:t>
       </w:r>
     </w:p>
     <w:p>
       <w:r>
-        <w:t>The biggest challenge I ran into was getting the button centered in the middle of the screen. At first nothing I did seemed to move it. I eventually learned that centering is not done on the button itself, you have to select the root LinearLayout in the Component Tree and change its gravity value. Once I unchecked bottom and set gravity to center (or checked center_horizontal and center_vertical together), all three elements finally moved to the middle. Understanding the difference between gravity (which positions the children inside a container) and layout_gravity (which positions an element inside its parent) was the key insight that made this click.</w:t>
+        <w:t>The biggest challenge I encountered was centering the button on the screen. I wanted the interface to look more balanced, but at first nothing I changed seemed to move it. I eventually realized that, because I wanted to center all three elements together, I needed to select the root LinearLayout in the Component Tree and change its gravity value. After removing the bottom setting and using center, or combining center_horizontal and center_vertical, the button, Plain Text field, and TextView moved to the middle of the screen. Understanding the difference between gravity, which positions child views inside a container, and layout_gravity, which positions an individual view within its parent, was the key concept that made this process clearer.</w:t>
       </w:r>
     </w:p>
     <w:p>
       <w:r>
-        <w:t>My second challenge was that the button stretched across the entire width of the screen instead of only being as wide as its text. I fixed this by changing the button’s layout_width from match_parent to wrap_content, which tells the button to only take up as much space as its “Say Hello” label needs. Along the way I also accidentally created a duplicate ID by naming two views rootLayout, and I had to rename the Plain Text field back to nameText to clear the error, since two views cannot share the same ID.</w:t>
+        <w:t>My second challenge was that the button stretched across the entire width of the screen instead of fitting around its text. I corrected this by changing the button’s layout_width from match_parent to wrap_content, which made it only as wide as the “Say Hello” label required. I also accidentally created a duplicate ID by assigning rootLayout to both the root layout and the Plain Text field. I fixed the error by changing the Plain Text field’s ID back to nameText, since every view in the same layout must have a unique ID.</w:t>
       </w:r>
     </w:p>
     <w:p>
@@ -151,15 +277,17 @@
         <w:t>Overall, once I understood that I had to select the correct element in the Component Tree before editing its attributes, the Layout Editor started to make a lot more sense. My main remaining question is when it is better to build a layout visually with the editor versus editing the XML directly, and how the different layout containers (LinearLayout, ConstraintLayout, etc.) compare for positioning elements. I feel much more prepared to access and use Android Studio for the later work in this course.</w:t>
       </w:r>
     </w:p>
-    <w:p/>
+    <w:p>
+      <w:pPr>
+        <w:pStyle w:val="Heading1"/>
+      </w:pPr>
+      <w:r>
+        <w:t>AI Tool Acknowledgment</w:t>
+      </w:r>
+    </w:p>
     <w:p>
       <w:r>
-        <w:rPr>
-          <w:i/>
-          <w:color w:val="666666"/>
-          <w:sz w:val="18"/>
-        </w:rPr>
-        <w:t>(Discussion word count: ~365 words.)</w:t>
+        <w:t>I used an AI assistant (Anthropic’s Claude) to help format this Word document and place the screenshots. The Android Studio project, the layout, and the written discussion of my challenges are my own work.</w:t>
       </w:r>
     </w:p>
     <w:sectPr>

</xml_diff>

<commit_message>
Update assignment document and reflection formatting
</commit_message>
<xml_diff>
--- a/docs/Android_Studio_Assignment_Justin_Guida.docx
+++ b/docs/Android_Studio_Assignment_Justin_Guida.docx
@@ -275,19 +275,6 @@
     <w:p>
       <w:r>
         <w:t>Overall, once I understood that I had to select the correct element in the Component Tree before editing its attributes, the Layout Editor started to make a lot more sense. My main remaining question is when it is better to build a layout visually with the editor versus editing the XML directly, and how the different layout containers (LinearLayout, ConstraintLayout, etc.) compare for positioning elements. I feel much more prepared to access and use Android Studio for the later work in this course.</w:t>
-      </w:r>
-    </w:p>
-    <w:p>
-      <w:pPr>
-        <w:pStyle w:val="Heading1"/>
-      </w:pPr>
-      <w:r>
-        <w:t>AI Tool Acknowledgment</w:t>
-      </w:r>
-    </w:p>
-    <w:p>
-      <w:r>
-        <w:t>I used an AI assistant (Anthropic’s Claude) to help format this Word document and place the screenshots. The Android Studio project, the layout, and the written discussion of my challenges are my own work.</w:t>
       </w:r>
     </w:p>
     <w:sectPr>

</xml_diff>